<commit_message>
Correct RT request letter for GMPI office use
Co-authored-by: arena-agent <297053741+arena-agent@users.noreply.github.com>
</commit_message>
<xml_diff>
--- a/Surat-Permohonan-Izin-Menempati-Tempat-Tinggal.docx
+++ b/Surat-Permohonan-Izin-Menempati-Tempat-Tinggal.docx
@@ -4,13 +4,13 @@
   <w:body>
     <w:p>
       <w:pPr>
-        <w:spacing w:after="100"/>
+        <w:spacing w:after="80"/>
         <w:jc w:val="right"/>
       </w:pPr>
       <w:r>
         <w:rPr>
           <w:rFonts w:ascii="Arial" w:hAnsi="Arial"/>
-          <w:sz w:val="21"/>
+          <w:sz w:val="20"/>
         </w:rPr>
         <w:t>Sidoarjo, [tanggal surat]</w:t>
       </w:r>
@@ -32,7 +32,7 @@
           <w:rFonts w:ascii="Arial" w:hAnsi="Arial"/>
           <w:sz w:val="20"/>
         </w:rPr>
-        <w:t>[diisi sekretariat]</w:t>
+        <w:t>[nomor surat]</w:t>
       </w:r>
     </w:p>
     <w:p>
@@ -72,18 +72,17 @@
           <w:rFonts w:ascii="Arial" w:hAnsi="Arial"/>
           <w:sz w:val="20"/>
         </w:rPr>
-        <w:t>Permohonan Izin Menempati Tempat Tinggal</w:t>
+        <w:t>Permohonan Izin Penggunaan Tempat sebagai Kantor GMPI Sidoarjo</w:t>
       </w:r>
     </w:p>
     <w:p>
       <w:pPr>
-        <w:spacing w:after="60"/>
+        <w:spacing w:before="80" w:after="100"/>
       </w:pPr>
       <w:r>
         <w:rPr>
           <w:rFonts w:ascii="Arial" w:hAnsi="Arial"/>
-          <w:b w:val="0"/>
-          <w:sz w:val="21"/>
+          <w:sz w:val="20"/>
         </w:rPr>
         <w:t>Kepada Yth.</w:t>
         <w:br/>
@@ -92,7 +91,7 @@
         <w:rPr>
           <w:rFonts w:ascii="Arial" w:hAnsi="Arial"/>
           <w:b/>
-          <w:sz w:val="21"/>
+          <w:sz w:val="20"/>
         </w:rPr>
         <w:t>Ketua RT ____ / RW ____</w:t>
         <w:br/>
@@ -100,7 +99,7 @@
       <w:r>
         <w:rPr>
           <w:rFonts w:ascii="Arial" w:hAnsi="Arial"/>
-          <w:sz w:val="21"/>
+          <w:sz w:val="20"/>
         </w:rPr>
         <w:t>Kelurahan Kemiri, Kecamatan Sidoarjo</w:t>
         <w:br/>
@@ -108,7 +107,7 @@
       <w:r>
         <w:rPr>
           <w:rFonts w:ascii="Arial" w:hAnsi="Arial"/>
-          <w:sz w:val="21"/>
+          <w:sz w:val="20"/>
         </w:rPr>
         <w:t>Kabupaten Sidoarjo</w:t>
         <w:br/>
@@ -116,14 +115,14 @@
       <w:r>
         <w:rPr>
           <w:rFonts w:ascii="Arial" w:hAnsi="Arial"/>
-          <w:sz w:val="21"/>
+          <w:sz w:val="20"/>
         </w:rPr>
         <w:t>di Tempat</w:t>
       </w:r>
     </w:p>
     <w:p>
       <w:pPr>
-        <w:spacing w:before="40" w:after="100"/>
+        <w:spacing w:after="80"/>
       </w:pPr>
       <w:r>
         <w:t>Dengan hormat,</w:t>
@@ -131,7 +130,7 @@
     </w:p>
     <w:p>
       <w:pPr>
-        <w:spacing w:after="40"/>
+        <w:spacing w:after="20"/>
       </w:pPr>
       <w:r>
         <w:t>Saya yang bertanda tangan di bawah ini:</w:t>
@@ -139,7 +138,7 @@
     </w:p>
     <w:p>
       <w:pPr>
-        <w:spacing w:after="0" w:line="247" w:lineRule="auto"/>
+        <w:spacing w:after="0"/>
         <w:ind w:left="340"/>
       </w:pPr>
       <w:r>
@@ -154,12 +153,12 @@
           <w:rFonts w:ascii="Arial" w:hAnsi="Arial"/>
           <w:sz w:val="20"/>
         </w:rPr>
-        <w:t>[nama lengkap pemohon]</w:t>
+        <w:t>[nama Ketua DPD GMPI Sidoarjo]</w:t>
       </w:r>
     </w:p>
     <w:p>
       <w:pPr>
-        <w:spacing w:after="0" w:line="247" w:lineRule="auto"/>
+        <w:spacing w:after="0"/>
         <w:ind w:left="340"/>
       </w:pPr>
       <w:r>
@@ -167,70 +166,27 @@
           <w:rFonts w:ascii="Arial" w:hAnsi="Arial"/>
           <w:sz w:val="20"/>
         </w:rPr>
-        <w:t xml:space="preserve">NIK          : </w:t>
+        <w:t xml:space="preserve">Jabatan      : </w:t>
       </w:r>
       <w:r>
         <w:rPr>
           <w:rFonts w:ascii="Arial" w:hAnsi="Arial"/>
           <w:sz w:val="20"/>
         </w:rPr>
-        <w:t>[NIK pemohon]</w:t>
+        <w:t>Ketua DPD GMPI Sidoarjo</w:t>
       </w:r>
     </w:p>
     <w:p>
       <w:pPr>
-        <w:spacing w:after="0" w:line="247" w:lineRule="auto"/>
-        <w:ind w:left="340"/>
+        <w:spacing w:before="100" w:after="60"/>
       </w:pPr>
       <w:r>
-        <w:rPr>
-          <w:rFonts w:ascii="Arial" w:hAnsi="Arial"/>
-          <w:sz w:val="20"/>
-        </w:rPr>
-        <w:t xml:space="preserve">No. HP       : </w:t>
-      </w:r>
-      <w:r>
-        <w:rPr>
-          <w:rFonts w:ascii="Arial" w:hAnsi="Arial"/>
-          <w:sz w:val="20"/>
-        </w:rPr>
-        <w:t>[nomor telepon aktif]</w:t>
+        <w:t>Dengan ini, atas nama GMPI DPD Sidoarjo, kami mengajukan permohonan izin kepada Ketua RT/RW setempat untuk menggunakan dan menempati tempat pada alamat berikut sebagai kantor/sekretariat GMPI DPD Sidoarjo:</w:t>
       </w:r>
     </w:p>
     <w:p>
       <w:pPr>
-        <w:spacing w:after="0" w:line="247" w:lineRule="auto"/>
-        <w:ind w:left="340"/>
-      </w:pPr>
-      <w:r>
-        <w:rPr>
-          <w:rFonts w:ascii="Arial" w:hAnsi="Arial"/>
-          <w:sz w:val="20"/>
-        </w:rPr>
-        <w:t xml:space="preserve">Alamat asal  : </w:t>
-      </w:r>
-      <w:r>
-        <w:rPr>
-          <w:rFonts w:ascii="Arial" w:hAnsi="Arial"/>
-          <w:sz w:val="20"/>
-        </w:rPr>
-        <w:t>[alamat asal pemohon]</w:t>
-      </w:r>
-    </w:p>
-    <w:p>
-      <w:pPr>
-        <w:spacing w:before="100" w:after="80"/>
-      </w:pPr>
-      <w:r>
-        <w:rPr>
-          <w:sz w:val="21"/>
-        </w:rPr>
-        <w:t>Dengan ini saya mengajukan permohonan izin kepada Ketua RT setempat untuk menempati tempat tinggal yang beralamat di:</w:t>
-      </w:r>
-    </w:p>
-    <w:p>
-      <w:pPr>
-        <w:spacing w:after="40"/>
+        <w:spacing w:after="60"/>
         <w:ind w:left="340"/>
       </w:pPr>
       <w:r>
@@ -244,18 +200,10 @@
     </w:p>
     <w:p>
       <w:pPr>
-        <w:spacing w:after="80"/>
+        <w:spacing w:after="40"/>
       </w:pPr>
       <w:r>
-        <w:t>Rencana mulai menempati tempat tinggal tersebut pada tanggal [tanggal mulai menempati].</w:t>
-      </w:r>
-    </w:p>
-    <w:p>
-      <w:pPr>
-        <w:spacing w:after="20"/>
-      </w:pPr>
-      <w:r>
-        <w:t>Saya menyatakan bersedia untuk:</w:t>
+        <w:t>Rencana penggunaan kantor dimulai pada [tanggal mulai]. Kegiatan yang dilakukan terutama berupa administrasi dan koordinasi organisasi. Kami berkomitmen untuk:</w:t>
       </w:r>
     </w:p>
     <w:p>
@@ -266,9 +214,9 @@
       <w:r>
         <w:rPr>
           <w:rFonts w:ascii="Arial" w:hAnsi="Arial"/>
-          <w:sz w:val="20"/>
+          <w:sz w:val="19"/>
         </w:rPr>
-        <w:t>- melapor dan melengkapi pendataan warga sesuai ketentuan RT/RW setempat;</w:t>
+        <w:t>- mematuhi ketentuan RT/RW dan peraturan lingkungan setempat;</w:t>
       </w:r>
     </w:p>
     <w:p>
@@ -279,9 +227,9 @@
       <w:r>
         <w:rPr>
           <w:rFonts w:ascii="Arial" w:hAnsi="Arial"/>
-          <w:sz w:val="20"/>
+          <w:sz w:val="19"/>
         </w:rPr>
-        <w:t>- mematuhi peraturan lingkungan serta menjaga ketertiban, kebersihan, keamanan, dan kerukunan warga;</w:t>
+        <w:t>- menjaga ketertiban, kebersihan, keamanan, serta hubungan baik dengan warga;</w:t>
       </w:r>
     </w:p>
     <w:p>
@@ -292,90 +240,116 @@
       <w:r>
         <w:rPr>
           <w:rFonts w:ascii="Arial" w:hAnsi="Arial"/>
-          <w:sz w:val="20"/>
+          <w:sz w:val="19"/>
         </w:rPr>
-        <w:t>- menghubungi Ketua RT apabila terdapat perubahan data atau hal penting terkait tempat tinggal tersebut.</w:t>
+        <w:t>- mengatur kegiatan dan kendaraan agar tidak mengganggu kenyamanan atau akses warga;</w:t>
       </w:r>
     </w:p>
     <w:p>
       <w:pPr>
-        <w:spacing w:before="80" w:after="120"/>
+        <w:spacing w:after="20"/>
+        <w:ind w:left="397" w:hanging="283"/>
       </w:pPr>
       <w:r>
-        <w:t>Demikian permohonan ini saya sampaikan. Besar harapan saya agar permohonan ini dapat dipertimbangkan. Atas perhatian dan kebijaksanaan Bapak/Ibu Ketua RT, saya ucapkan terima kasih.</w:t>
+        <w:rPr>
+          <w:rFonts w:ascii="Arial" w:hAnsi="Arial"/>
+          <w:sz w:val="19"/>
+        </w:rPr>
+        <w:t>- berkoordinasi dengan Ketua RT/RW apabila ada perubahan penggunaan tempat atau kegiatan.</w:t>
       </w:r>
     </w:p>
     <w:p>
       <w:pPr>
-        <w:spacing w:after="440"/>
-        <w:jc w:val="right"/>
+        <w:spacing w:before="80" w:after="100"/>
       </w:pPr>
       <w:r>
-        <w:rPr>
-          <w:rFonts w:ascii="Arial" w:hAnsi="Arial"/>
-          <w:sz w:val="20"/>
-        </w:rPr>
-        <w:t>Hormat saya,</w:t>
-        <w:br/>
-        <w:t>Pemohon,</w:t>
+        <w:t>Demikian permohonan ini kami sampaikan. Kami berharap Bapak/Ibu Ketua RT/RW dapat mempertimbangkan dan memberikan persetujuan sesuai ketentuan yang berlaku. Atas perhatian dan kerja samanya, kami ucapkan terima kasih.</w:t>
       </w:r>
     </w:p>
-    <w:p>
-      <w:pPr>
-        <w:spacing w:after="100"/>
-        <w:jc w:val="right"/>
-      </w:pPr>
-      <w:r>
-        <w:rPr>
-          <w:rFonts w:ascii="Arial" w:hAnsi="Arial"/>
-          <w:b/>
-          <w:sz w:val="20"/>
-        </w:rPr>
-        <w:t>[nama lengkap pemohon]</w:t>
-      </w:r>
-    </w:p>
-    <w:p>
-      <w:pPr>
-        <w:spacing w:before="80" w:after="20"/>
-      </w:pPr>
-      <w:r>
-        <w:rPr>
-          <w:rFonts w:ascii="Arial" w:hAnsi="Arial"/>
-          <w:b/>
-          <w:sz w:val="18"/>
-        </w:rPr>
-        <w:t>KEPUTUSAN KETUA RT (diisi oleh Ketua RT)</w:t>
-      </w:r>
-    </w:p>
-    <w:p>
-      <w:pPr>
-        <w:spacing w:after="240"/>
-      </w:pPr>
-      <w:r>
-        <w:rPr>
-          <w:rFonts w:ascii="Arial" w:hAnsi="Arial"/>
-          <w:sz w:val="18"/>
-        </w:rPr>
-        <w:t>[  ] Disetujui     [  ] Belum dapat disetujui     Tanggal: ____ / ____ / ______</w:t>
-      </w:r>
-    </w:p>
-    <w:p>
-      <w:pPr>
-        <w:spacing w:after="0"/>
-        <w:jc w:val="right"/>
-      </w:pPr>
-      <w:r>
-        <w:rPr>
-          <w:rFonts w:ascii="Arial" w:hAnsi="Arial"/>
-          <w:sz w:val="18"/>
-        </w:rPr>
-        <w:t>Ketua RT ____ / RW ____</w:t>
-        <w:br/>
-        <w:br/>
-        <w:br/>
-        <w:t>(____________________________)</w:t>
-      </w:r>
-    </w:p>
+    <w:tbl>
+      <w:tblPr>
+        <w:tblW w:type="auto" w:w="0"/>
+        <w:jc w:val="center"/>
+        <w:tblLayout w:type="fixed"/>
+        <w:tblLook w:firstColumn="1" w:firstRow="1" w:lastColumn="0" w:lastRow="0" w:noHBand="0" w:noVBand="1" w:val="04A0"/>
+      </w:tblPr>
+      <w:tblGrid>
+        <w:gridCol w:w="4706"/>
+        <w:gridCol w:w="4706"/>
+      </w:tblGrid>
+      <w:tr>
+        <w:tc>
+          <w:tcPr>
+            <w:tcW w:type="dxa" w:w="4422"/>
+            <w:vAlign w:val="top"/>
+            <w:tcBorders>
+              <w:top w:val="nil"/>
+              <w:left w:val="nil"/>
+              <w:bottom w:val="nil"/>
+              <w:right w:val="nil"/>
+              <w:insideH w:val="nil"/>
+              <w:insideV w:val="nil"/>
+            </w:tcBorders>
+          </w:tcPr>
+          <w:p>
+            <w:pPr>
+              <w:spacing w:after="20"/>
+              <w:jc w:val="center"/>
+            </w:pPr>
+            <w:r>
+              <w:rPr>
+                <w:rFonts w:ascii="Arial" w:hAnsi="Arial"/>
+                <w:sz w:val="18"/>
+              </w:rPr>
+              <w:t>Hormat kami,</w:t>
+              <w:br/>
+              <w:t>Ketua DPD GMPI Sidoarjo</w:t>
+              <w:br/>
+              <w:br/>
+              <w:br/>
+              <w:t>[nama Ketua DPD]</w:t>
+            </w:r>
+          </w:p>
+        </w:tc>
+        <w:tc>
+          <w:tcPr>
+            <w:tcW w:type="dxa" w:w="4422"/>
+            <w:vAlign w:val="top"/>
+            <w:tcBorders>
+              <w:top w:val="nil"/>
+              <w:left w:val="nil"/>
+              <w:bottom w:val="nil"/>
+              <w:right w:val="nil"/>
+              <w:insideH w:val="nil"/>
+              <w:insideV w:val="nil"/>
+            </w:tcBorders>
+          </w:tcPr>
+          <w:p>
+            <w:pPr>
+              <w:spacing w:after="20"/>
+              <w:jc w:val="center"/>
+            </w:pPr>
+            <w:r>
+              <w:rPr>
+                <w:rFonts w:ascii="Arial" w:hAnsi="Arial"/>
+                <w:sz w:val="17"/>
+              </w:rPr>
+              <w:t>KEPUTUSAN KETUA RT/RW</w:t>
+              <w:br/>
+              <w:t>(diisi oleh RT/RW)</w:t>
+              <w:br/>
+              <w:t>[  ] Disetujui  [  ] Belum disetujui</w:t>
+              <w:br/>
+              <w:t>Tanggal: ____ / ____ / ______</w:t>
+              <w:br/>
+              <w:br/>
+              <w:br/>
+              <w:t>(____________________)</w:t>
+            </w:r>
+          </w:p>
+        </w:tc>
+      </w:tr>
+    </w:tbl>
     <w:sectPr>
       <w:headerReference w:type="default" r:id="rId9"/>
       <w:pgSz w:w="11906" w:h="16838"/>
@@ -803,7 +777,7 @@
     <w:qFormat/>
     <w:rsid w:val="00FC693F"/>
     <w:pPr>
-      <w:spacing w:after="80" w:line="269" w:lineRule="auto"/>
+      <w:spacing w:after="80" w:line="264" w:lineRule="auto"/>
     </w:pPr>
     <w:rPr>
       <w:rFonts w:ascii="Arial" w:hAnsi="Arial"/>

</xml_diff>